<commit_message>
Restringe impressão e exportação Word à equipe do projeto
Nos 7 formulários com restrição por equipe (Canvas, TAP, Planejamento,
EAP, SMP, TEP, RLA), os botões Imprimir e Exportar Word de um registro
já salvo agora exigem fazer parte da equipe do projeto (ou ser Admin) —
sem exceção para o Gerente de Projetos, diferente da regra de
editar/excluir. Botões ficam ocultos para quem não tem permissão.

Central de Ajuda, Manual de Uso (v2.76) e Regras de Acesso e
Permissões (seção 5.5) atualizados.

Co-Authored-By: Claude Sonnet 5 <noreply@anthropic.com>
</commit_message>
<xml_diff>
--- a/Regras de Acesso e Permissoes - Sistema UNIALFA.docx
+++ b/Regras de Acesso e Permissoes - Sistema UNIALFA.docx
@@ -3017,6 +3017,28 @@
     </w:p>
     <w:p>
       <w:pPr>
+        <w:pStyle w:val="PargrafodaLista"/>
+        <w:numPr>
+          <w:ilvl w:val="0"/>
+          <w:numId w:val="20"/>
+        </w:numPr>
+        <w:spacing w:before="240" w:after="80" w:line="260" w:lineRule="auto"/>
+        <w:ind w:left="700"/>
+        <w:rPr>
+          <w:color w:val="1A1A1A"/>
+          <w:sz w:val="22"/>
+        </w:rPr>
+      </w:pPr>
+      <w:r>
+        <w:rPr>
+          <w:color w:val="1A1A1A"/>
+          <w:sz w:val="22"/>
+        </w:rPr>
+        <w:t>A mesma restricao vale para os botoes Imprimir e Exportar Word de um registro ja salvo, nesses 7 formularios (detalhado na secao 5.5).</w:t>
+      </w:r>
+    </w:p>
+    <w:p>
+      <w:pPr>
         <w:spacing w:before="240" w:after="120" w:line="260" w:lineRule="auto"/>
         <w:rPr>
           <w:b/>
@@ -3316,7 +3338,15 @@
           <w:color w:val="1A1A1A"/>
           <w:sz w:val="22"/>
         </w:rPr>
-        <w:t>Nao se aplica ao Plano de Comunicacao de Projeto (secao 3.7 ja cobre a edicao desse formulario separadamente) nem ao Relatorio de Situacao/Relatorio de Entregas, que sao documentos unicos por projeto sem o conceito de "registro individual criado por alguem".</w:t>
+        <w:t xml:space="preserve">Nao se aplica ao Plano de Comunicacao de Projeto (secao 3.7 ja cobre a edicao desse formulario separadamente) nem ao Relatorio de Situacao/Relatorio de </w:t>
+      </w:r>
+      <w:r>
+        <w:rPr>
+          <w:color w:val="1A1A1A"/>
+          <w:sz w:val="22"/>
+        </w:rPr>
+        <w:lastRenderedPageBreak/>
+        <w:t>Entregas, que sao documentos unicos por projeto sem o conceito de "registro individual criado por alguem".</w:t>
       </w:r>
     </w:p>
     <w:p>
@@ -3332,8 +3362,123 @@
           <w:color w:val="1A1A1A"/>
           <w:sz w:val="22"/>
         </w:rPr>
-        <w:lastRenderedPageBreak/>
         <w:t>Desde 15/09/2026, essa regra tambem e aplicada diretamente no banco de dados (politicas de RLS na tabela kv_store), nao so no JavaScript do navegador - alguem tentando editar ou excluir um registro sem permissao direto pela API, contornando a tela do sistema, tambem e bloqueado. Fica documentado no arquivo supabase/migrations/20260915143738_kv_store_row_level_access_control.sql do repositorio. Duas coisas ficaram de fora dessa camada de banco, so continuam no JavaScript: a decisao especifica de quem aprova o Gate 1/Gate 2 (mais restrita que a regra geral de edicao) e as regras dos 3 relatorios de chave unica (secao 3.7 e o Gate 2 do Relatorio de Entregas).</w:t>
+      </w:r>
+    </w:p>
+    <w:p>
+      <w:pPr>
+        <w:spacing w:before="240" w:after="120" w:line="280" w:lineRule="auto"/>
+        <w:rPr>
+          <w:b/>
+          <w:color w:val="B91D2E"/>
+          <w:sz w:val="26"/>
+        </w:rPr>
+      </w:pPr>
+      <w:r>
+        <w:rPr>
+          <w:b/>
+          <w:color w:val="B91D2E"/>
+          <w:sz w:val="26"/>
+        </w:rPr>
+        <w:t>5.5 Quem pode imprimir ou exportar um registro</w:t>
+      </w:r>
+    </w:p>
+    <w:p>
+      <w:pPr>
+        <w:spacing w:before="240" w:line="280" w:lineRule="auto"/>
+        <w:rPr>
+          <w:color w:val="1A1A1A"/>
+          <w:sz w:val="22"/>
+        </w:rPr>
+      </w:pPr>
+      <w:r>
+        <w:rPr>
+          <w:color w:val="1A1A1A"/>
+          <w:sz w:val="22"/>
+        </w:rPr>
+        <w:t>Nos mesmos 7 formularios com restricao por equipe (secao 5.1), os botoes Imprimir e Exportar Word de um registro ja salvo tambem passam a exigir fazer parte da equipe daquele projeto, ou ser Admin.</w:t>
+      </w:r>
+    </w:p>
+    <w:p>
+      <w:pPr>
+        <w:pStyle w:val="PargrafodaLista"/>
+        <w:numPr>
+          <w:ilvl w:val="0"/>
+          <w:numId w:val="23"/>
+        </w:numPr>
+        <w:spacing w:before="240" w:after="80" w:line="260" w:lineRule="auto"/>
+        <w:ind w:left="700"/>
+        <w:rPr>
+          <w:color w:val="1A1A1A"/>
+          <w:sz w:val="22"/>
+        </w:rPr>
+      </w:pPr>
+      <w:r>
+        <w:rPr>
+          <w:color w:val="1A1A1A"/>
+          <w:sz w:val="22"/>
+        </w:rPr>
+        <w:t>Diferente da regra de editar/excluir (secao 5.4), aqui nao ha excecao para o papel Gerente de Projetos - precisa realmente estar na equipe do projeto (ou ser Admin) para imprimir ou exportar um registro.</w:t>
+      </w:r>
+    </w:p>
+    <w:p>
+      <w:pPr>
+        <w:pStyle w:val="PargrafodaLista"/>
+        <w:numPr>
+          <w:ilvl w:val="0"/>
+          <w:numId w:val="23"/>
+        </w:numPr>
+        <w:spacing w:before="240" w:after="80" w:line="260" w:lineRule="auto"/>
+        <w:ind w:left="700"/>
+        <w:rPr>
+          <w:color w:val="1A1A1A"/>
+          <w:sz w:val="22"/>
+        </w:rPr>
+      </w:pPr>
+      <w:r>
+        <w:rPr>
+          <w:color w:val="1A1A1A"/>
+          <w:sz w:val="22"/>
+        </w:rPr>
+        <w:t>Os botoes "Imprimir" e "Exportar Word" ficam ocultos para quem nao faz parte da equipe, da mesma forma que os botoes de editar/excluir.</w:t>
+      </w:r>
+    </w:p>
+    <w:p>
+      <w:pPr>
+        <w:pStyle w:val="PargrafodaLista"/>
+        <w:numPr>
+          <w:ilvl w:val="0"/>
+          <w:numId w:val="23"/>
+        </w:numPr>
+        <w:spacing w:before="240" w:after="80" w:line="260" w:lineRule="auto"/>
+        <w:ind w:left="700"/>
+        <w:rPr>
+          <w:color w:val="1A1A1A"/>
+          <w:sz w:val="22"/>
+        </w:rPr>
+      </w:pPr>
+      <w:r>
+        <w:rPr>
+          <w:color w:val="1A1A1A"/>
+          <w:sz w:val="22"/>
+        </w:rPr>
+        <w:t>Nao se aplica aos outros 5 formularios sem restricao por equipe (secao 5.3) nem aos relatorios agregados - continuam sem restricao de impressao/exportacao por equipe.</w:t>
+      </w:r>
+    </w:p>
+    <w:p>
+      <w:pPr>
+        <w:spacing w:before="240" w:line="280" w:lineRule="auto"/>
+        <w:rPr>
+          <w:color w:val="1A1A1A"/>
+          <w:sz w:val="22"/>
+        </w:rPr>
+      </w:pPr>
+      <w:r>
+        <w:rPr>
+          <w:color w:val="1A1A1A"/>
+          <w:sz w:val="22"/>
+        </w:rPr>
+        <w:t>Essa regra e aplicada apenas no JavaScript do navegador, nao no banco de dados - diferente da trava de editar/excluir (secao 5.4), que desde 15/09/2026 tambem e reforcada por politicas de RLS na tabela kv_store.</w:t>
       </w:r>
     </w:p>
     <w:p>
@@ -3699,6 +3844,7 @@
                 <w:color w:val="1A1A1A"/>
                 <w:sz w:val="19"/>
               </w:rPr>
+              <w:lastRenderedPageBreak/>
               <w:t>TAP</w:t>
             </w:r>
           </w:p>
@@ -4343,7 +4489,6 @@
                 <w:color w:val="1A1A1A"/>
                 <w:sz w:val="19"/>
               </w:rPr>
-              <w:lastRenderedPageBreak/>
               <w:t>RLA</w:t>
             </w:r>
           </w:p>
@@ -5014,7 +5159,7 @@
 <file path=word/numbering.xml><?xml version="1.0" encoding="utf-8"?>
 <w:numbering xmlns:wpc="http://schemas.microsoft.com/office/word/2010/wordprocessingCanvas" xmlns:cx="http://schemas.microsoft.com/office/drawing/2014/chartex" xmlns:cx1="http://schemas.microsoft.com/office/drawing/2015/9/8/chartex" xmlns:cx2="http://schemas.microsoft.com/office/drawing/2015/10/21/chartex" xmlns:cx3="http://schemas.microsoft.com/office/drawing/2016/5/9/chartex" xmlns:cx4="http://schemas.microsoft.com/office/drawing/2016/5/10/chartex" xmlns:cx5="http://schemas.microsoft.com/office/drawing/2016/5/11/chartex" xmlns:cx6="http://schemas.microsoft.com/office/drawing/2016/5/12/chartex" xmlns:cx7="http://schemas.microsoft.com/office/drawing/2016/5/13/chartex" xmlns:cx8="http://schemas.microsoft.com/office/drawing/2016/5/14/chartex" xmlns:mc="http://schemas.openxmlformats.org/markup-compatibility/2006" xmlns:aink="http://schemas.microsoft.com/office/drawing/2016/ink" xmlns:am3d="http://schemas.microsoft.com/office/drawing/2017/model3d" xmlns:o="urn:schemas-microsoft-com:office:office" xmlns:oel="http://schemas.microsoft.com/office/2019/extlst" xmlns:r="http://schemas.openxmlformats.org/officeDocument/2006/relationships" xmlns:m="http://schemas.openxmlformats.org/officeDocument/2006/math" xmlns:v="urn:schemas-microsoft-com:vml" xmlns:wp14="http://schemas.microsoft.com/office/word/2010/wordprocessingDrawing" xmlns:wp="http://schemas.openxmlformats.org/drawingml/2006/wordprocessingDrawing" xmlns:w10="urn:schemas-microsoft-com:office:word" xmlns:w="http://schemas.openxmlformats.org/wordprocessingml/2006/main" xmlns:w14="http://schemas.microsoft.com/office/word/2010/wordml" xmlns:w15="http://schemas.microsoft.com/office/word/2012/wordml" xmlns:w16cex="http://schemas.microsoft.com/office/word/2018/wordml/cex" xmlns:w16cid="http://schemas.microsoft.com/office/word/2016/wordml/cid" xmlns:w16="http://schemas.microsoft.com/office/word/2018/wordml" xmlns:w16du="http://schemas.microsoft.com/office/word/2023/wordml/word16du" xmlns:w16sdtdh="http://schemas.microsoft.com/office/word/2020/wordml/sdtdatahash" xmlns:w16sdtfl="http://schemas.microsoft.com/office/word/2024/wordml/sdtformatlock" xmlns:w16se="http://schemas.microsoft.com/office/word/2015/wordml/symex" xmlns:wpg="http://schemas.microsoft.com/office/word/2010/wordprocessingGroup" xmlns:wpi="http://schemas.microsoft.com/office/word/2010/wordprocessingInk" xmlns:wne="http://schemas.microsoft.com/office/word/2006/wordml" xmlns:wps="http://schemas.microsoft.com/office/word/2010/wordprocessingShape" mc:Ignorable="w14 w15 w16se w16cid w16 w16cex w16sdtdh w16sdtfl w16du wp14">
   <w:abstractNum w:abstractNumId="0" w15:restartNumberingAfterBreak="0">
-    <w:nsid w:val="052A3CA5"/>
+    <w:nsid w:val="057C0A2B"/>
     <w:multiLevelType w:val="singleLevel"/>
     <w:tmpl w:val="04160001"/>
     <w:lvl w:ilvl="0">
@@ -5031,7 +5176,7 @@
     </w:lvl>
   </w:abstractNum>
   <w:abstractNum w:abstractNumId="1" w15:restartNumberingAfterBreak="0">
-    <w:nsid w:val="1B66570F"/>
+    <w:nsid w:val="08B11837"/>
     <w:multiLevelType w:val="singleLevel"/>
     <w:tmpl w:val="04160001"/>
     <w:lvl w:ilvl="0">
@@ -5048,7 +5193,7 @@
     </w:lvl>
   </w:abstractNum>
   <w:abstractNum w:abstractNumId="2" w15:restartNumberingAfterBreak="0">
-    <w:nsid w:val="1FAE1B7C"/>
+    <w:nsid w:val="0D663755"/>
     <w:multiLevelType w:val="singleLevel"/>
     <w:tmpl w:val="04160001"/>
     <w:lvl w:ilvl="0">
@@ -5065,7 +5210,7 @@
     </w:lvl>
   </w:abstractNum>
   <w:abstractNum w:abstractNumId="3" w15:restartNumberingAfterBreak="0">
-    <w:nsid w:val="1FF412F8"/>
+    <w:nsid w:val="13C93E3E"/>
     <w:multiLevelType w:val="singleLevel"/>
     <w:tmpl w:val="04160001"/>
     <w:lvl w:ilvl="0">
@@ -5082,7 +5227,7 @@
     </w:lvl>
   </w:abstractNum>
   <w:abstractNum w:abstractNumId="4" w15:restartNumberingAfterBreak="0">
-    <w:nsid w:val="2A886871"/>
+    <w:nsid w:val="218650EC"/>
     <w:multiLevelType w:val="singleLevel"/>
     <w:tmpl w:val="04160001"/>
     <w:lvl w:ilvl="0">
@@ -5099,7 +5244,7 @@
     </w:lvl>
   </w:abstractNum>
   <w:abstractNum w:abstractNumId="5" w15:restartNumberingAfterBreak="0">
-    <w:nsid w:val="3A1152D0"/>
+    <w:nsid w:val="3AF46201"/>
     <w:multiLevelType w:val="singleLevel"/>
     <w:tmpl w:val="04160001"/>
     <w:lvl w:ilvl="0">
@@ -5116,7 +5261,7 @@
     </w:lvl>
   </w:abstractNum>
   <w:abstractNum w:abstractNumId="6" w15:restartNumberingAfterBreak="0">
-    <w:nsid w:val="3C4261CD"/>
+    <w:nsid w:val="3C497F26"/>
     <w:multiLevelType w:val="singleLevel"/>
     <w:tmpl w:val="04160001"/>
     <w:lvl w:ilvl="0">
@@ -5133,7 +5278,7 @@
     </w:lvl>
   </w:abstractNum>
   <w:abstractNum w:abstractNumId="7" w15:restartNumberingAfterBreak="0">
-    <w:nsid w:val="41092C36"/>
+    <w:nsid w:val="402E6050"/>
     <w:multiLevelType w:val="singleLevel"/>
     <w:tmpl w:val="04160001"/>
     <w:lvl w:ilvl="0">
@@ -5150,7 +5295,7 @@
     </w:lvl>
   </w:abstractNum>
   <w:abstractNum w:abstractNumId="8" w15:restartNumberingAfterBreak="0">
-    <w:nsid w:val="41744BB6"/>
+    <w:nsid w:val="43B128BE"/>
     <w:multiLevelType w:val="singleLevel"/>
     <w:tmpl w:val="04160001"/>
     <w:lvl w:ilvl="0">
@@ -5167,7 +5312,7 @@
     </w:lvl>
   </w:abstractNum>
   <w:abstractNum w:abstractNumId="9" w15:restartNumberingAfterBreak="0">
-    <w:nsid w:val="4B567217"/>
+    <w:nsid w:val="45EA55BA"/>
     <w:multiLevelType w:val="singleLevel"/>
     <w:tmpl w:val="04160001"/>
     <w:lvl w:ilvl="0">
@@ -5184,7 +5329,7 @@
     </w:lvl>
   </w:abstractNum>
   <w:abstractNum w:abstractNumId="10" w15:restartNumberingAfterBreak="0">
-    <w:nsid w:val="4D4769CE"/>
+    <w:nsid w:val="467836F8"/>
     <w:multiLevelType w:val="singleLevel"/>
     <w:tmpl w:val="04160001"/>
     <w:lvl w:ilvl="0">
@@ -5201,7 +5346,7 @@
     </w:lvl>
   </w:abstractNum>
   <w:abstractNum w:abstractNumId="11" w15:restartNumberingAfterBreak="0">
-    <w:nsid w:val="549223C9"/>
+    <w:nsid w:val="48C02EB3"/>
     <w:multiLevelType w:val="singleLevel"/>
     <w:tmpl w:val="04160001"/>
     <w:lvl w:ilvl="0">
@@ -5218,7 +5363,7 @@
     </w:lvl>
   </w:abstractNum>
   <w:abstractNum w:abstractNumId="12" w15:restartNumberingAfterBreak="0">
-    <w:nsid w:val="57B16312"/>
+    <w:nsid w:val="4B385ABF"/>
     <w:multiLevelType w:val="singleLevel"/>
     <w:tmpl w:val="04160001"/>
     <w:lvl w:ilvl="0">
@@ -5235,7 +5380,7 @@
     </w:lvl>
   </w:abstractNum>
   <w:abstractNum w:abstractNumId="13" w15:restartNumberingAfterBreak="0">
-    <w:nsid w:val="592704E8"/>
+    <w:nsid w:val="4E926C6A"/>
     <w:multiLevelType w:val="singleLevel"/>
     <w:tmpl w:val="04160001"/>
     <w:lvl w:ilvl="0">
@@ -5252,7 +5397,7 @@
     </w:lvl>
   </w:abstractNum>
   <w:abstractNum w:abstractNumId="14" w15:restartNumberingAfterBreak="0">
-    <w:nsid w:val="5DB8254D"/>
+    <w:nsid w:val="552E1542"/>
     <w:multiLevelType w:val="singleLevel"/>
     <w:tmpl w:val="04160001"/>
     <w:lvl w:ilvl="0">
@@ -5269,7 +5414,7 @@
     </w:lvl>
   </w:abstractNum>
   <w:abstractNum w:abstractNumId="15" w15:restartNumberingAfterBreak="0">
-    <w:nsid w:val="5EE42884"/>
+    <w:nsid w:val="58591744"/>
     <w:multiLevelType w:val="singleLevel"/>
     <w:tmpl w:val="04160001"/>
     <w:lvl w:ilvl="0">
@@ -5286,7 +5431,7 @@
     </w:lvl>
   </w:abstractNum>
   <w:abstractNum w:abstractNumId="16" w15:restartNumberingAfterBreak="0">
-    <w:nsid w:val="6D7608C0"/>
+    <w:nsid w:val="60A03470"/>
     <w:multiLevelType w:val="singleLevel"/>
     <w:tmpl w:val="04160001"/>
     <w:lvl w:ilvl="0">
@@ -5303,7 +5448,7 @@
     </w:lvl>
   </w:abstractNum>
   <w:abstractNum w:abstractNumId="17" w15:restartNumberingAfterBreak="0">
-    <w:nsid w:val="6F3174F6"/>
+    <w:nsid w:val="623723BB"/>
     <w:multiLevelType w:val="singleLevel"/>
     <w:tmpl w:val="04160001"/>
     <w:lvl w:ilvl="0">
@@ -5320,7 +5465,7 @@
     </w:lvl>
   </w:abstractNum>
   <w:abstractNum w:abstractNumId="18" w15:restartNumberingAfterBreak="0">
-    <w:nsid w:val="6F805392"/>
+    <w:nsid w:val="64CC2845"/>
     <w:multiLevelType w:val="singleLevel"/>
     <w:tmpl w:val="04160001"/>
     <w:lvl w:ilvl="0">
@@ -5337,7 +5482,7 @@
     </w:lvl>
   </w:abstractNum>
   <w:abstractNum w:abstractNumId="19" w15:restartNumberingAfterBreak="0">
-    <w:nsid w:val="70EA050E"/>
+    <w:nsid w:val="72A86261"/>
     <w:multiLevelType w:val="singleLevel"/>
     <w:tmpl w:val="04160001"/>
     <w:lvl w:ilvl="0">
@@ -5354,7 +5499,7 @@
     </w:lvl>
   </w:abstractNum>
   <w:abstractNum w:abstractNumId="20" w15:restartNumberingAfterBreak="0">
-    <w:nsid w:val="74A5399D"/>
+    <w:nsid w:val="72B860A2"/>
     <w:multiLevelType w:val="singleLevel"/>
     <w:tmpl w:val="04160001"/>
     <w:lvl w:ilvl="0">
@@ -5371,7 +5516,7 @@
     </w:lvl>
   </w:abstractNum>
   <w:abstractNum w:abstractNumId="21" w15:restartNumberingAfterBreak="0">
-    <w:nsid w:val="7C191A64"/>
+    <w:nsid w:val="77E30EE6"/>
     <w:multiLevelType w:val="singleLevel"/>
     <w:tmpl w:val="04160001"/>
     <w:lvl w:ilvl="0">
@@ -5387,71 +5532,91 @@
       </w:rPr>
     </w:lvl>
   </w:abstractNum>
-  <w:num w:numId="1" w16cid:durableId="1003899703">
+  <w:abstractNum w:abstractNumId="22" w15:restartNumberingAfterBreak="0">
+    <w:nsid w:val="7DC83321"/>
+    <w:multiLevelType w:val="singleLevel"/>
+    <w:tmpl w:val="04160001"/>
+    <w:lvl w:ilvl="0">
+      <w:start w:val="1"/>
+      <w:numFmt w:val="bullet"/>
+      <w:lvlText w:val=""/>
+      <w:lvlJc w:val="left"/>
+      <w:pPr>
+        <w:ind w:left="720" w:hanging="360"/>
+      </w:pPr>
+      <w:rPr>
+        <w:rFonts w:ascii="Symbol" w:hAnsi="Symbol" w:hint="default"/>
+      </w:rPr>
+    </w:lvl>
+  </w:abstractNum>
+  <w:num w:numId="1" w16cid:durableId="2000620096">
+    <w:abstractNumId w:val="18"/>
+  </w:num>
+  <w:num w:numId="2" w16cid:durableId="791947309">
+    <w:abstractNumId w:val="21"/>
+  </w:num>
+  <w:num w:numId="3" w16cid:durableId="585771850">
+    <w:abstractNumId w:val="19"/>
+  </w:num>
+  <w:num w:numId="4" w16cid:durableId="560168181">
+    <w:abstractNumId w:val="1"/>
+  </w:num>
+  <w:num w:numId="5" w16cid:durableId="1763648879">
+    <w:abstractNumId w:val="7"/>
+  </w:num>
+  <w:num w:numId="6" w16cid:durableId="33387919">
+    <w:abstractNumId w:val="6"/>
+  </w:num>
+  <w:num w:numId="7" w16cid:durableId="339309124">
+    <w:abstractNumId w:val="17"/>
+  </w:num>
+  <w:num w:numId="8" w16cid:durableId="944390305">
+    <w:abstractNumId w:val="3"/>
+  </w:num>
+  <w:num w:numId="9" w16cid:durableId="318971803">
+    <w:abstractNumId w:val="9"/>
+  </w:num>
+  <w:num w:numId="10" w16cid:durableId="730496121">
+    <w:abstractNumId w:val="22"/>
+  </w:num>
+  <w:num w:numId="11" w16cid:durableId="2027977774">
+    <w:abstractNumId w:val="11"/>
+  </w:num>
+  <w:num w:numId="12" w16cid:durableId="1181697126">
+    <w:abstractNumId w:val="13"/>
+  </w:num>
+  <w:num w:numId="13" w16cid:durableId="224023769">
     <w:abstractNumId w:val="8"/>
   </w:num>
-  <w:num w:numId="2" w16cid:durableId="1361131262">
-    <w:abstractNumId w:val="17"/>
+  <w:num w:numId="14" w16cid:durableId="669873512">
+    <w:abstractNumId w:val="20"/>
   </w:num>
-  <w:num w:numId="3" w16cid:durableId="1038354738">
-    <w:abstractNumId w:val="16"/>
+  <w:num w:numId="15" w16cid:durableId="1727073178">
+    <w:abstractNumId w:val="14"/>
   </w:num>
-  <w:num w:numId="4" w16cid:durableId="157769352">
+  <w:num w:numId="16" w16cid:durableId="1862626916">
+    <w:abstractNumId w:val="5"/>
+  </w:num>
+  <w:num w:numId="17" w16cid:durableId="1446466989">
+    <w:abstractNumId w:val="2"/>
+  </w:num>
+  <w:num w:numId="18" w16cid:durableId="966395528">
+    <w:abstractNumId w:val="12"/>
+  </w:num>
+  <w:num w:numId="19" w16cid:durableId="1575772618">
+    <w:abstractNumId w:val="10"/>
+  </w:num>
+  <w:num w:numId="20" w16cid:durableId="8415047">
     <w:abstractNumId w:val="15"/>
   </w:num>
-  <w:num w:numId="5" w16cid:durableId="1513687571">
-    <w:abstractNumId w:val="6"/>
+  <w:num w:numId="21" w16cid:durableId="93208283">
+    <w:abstractNumId w:val="4"/>
   </w:num>
-  <w:num w:numId="6" w16cid:durableId="393895738">
-    <w:abstractNumId w:val="18"/>
-  </w:num>
-  <w:num w:numId="7" w16cid:durableId="2081438587">
-    <w:abstractNumId w:val="3"/>
-  </w:num>
-  <w:num w:numId="8" w16cid:durableId="2000109679">
-    <w:abstractNumId w:val="2"/>
-  </w:num>
-  <w:num w:numId="9" w16cid:durableId="1943031635">
-    <w:abstractNumId w:val="13"/>
-  </w:num>
-  <w:num w:numId="10" w16cid:durableId="1027099034">
-    <w:abstractNumId w:val="9"/>
-  </w:num>
-  <w:num w:numId="11" w16cid:durableId="841354856">
-    <w:abstractNumId w:val="19"/>
-  </w:num>
-  <w:num w:numId="12" w16cid:durableId="219830449">
-    <w:abstractNumId w:val="12"/>
-  </w:num>
-  <w:num w:numId="13" w16cid:durableId="576987566">
-    <w:abstractNumId w:val="7"/>
-  </w:num>
-  <w:num w:numId="14" w16cid:durableId="1185052307">
-    <w:abstractNumId w:val="5"/>
-  </w:num>
-  <w:num w:numId="15" w16cid:durableId="354307116">
+  <w:num w:numId="22" w16cid:durableId="365330270">
     <w:abstractNumId w:val="0"/>
   </w:num>
-  <w:num w:numId="16" w16cid:durableId="53045267">
-    <w:abstractNumId w:val="21"/>
-  </w:num>
-  <w:num w:numId="17" w16cid:durableId="1694725490">
-    <w:abstractNumId w:val="14"/>
-  </w:num>
-  <w:num w:numId="18" w16cid:durableId="2044016268">
-    <w:abstractNumId w:val="11"/>
-  </w:num>
-  <w:num w:numId="19" w16cid:durableId="810563271">
-    <w:abstractNumId w:val="4"/>
-  </w:num>
-  <w:num w:numId="20" w16cid:durableId="361056938">
-    <w:abstractNumId w:val="1"/>
-  </w:num>
-  <w:num w:numId="21" w16cid:durableId="737019680">
-    <w:abstractNumId w:val="20"/>
-  </w:num>
-  <w:num w:numId="22" w16cid:durableId="90930539">
-    <w:abstractNumId w:val="10"/>
+  <w:num w:numId="23" w16cid:durableId="2071609196">
+    <w:abstractNumId w:val="16"/>
   </w:num>
 </w:numbering>
 </file>
@@ -5864,7 +6029,7 @@
     <w:link w:val="Ttulo1Char"/>
     <w:uiPriority w:val="9"/>
     <w:qFormat/>
-    <w:rsid w:val="007C1277"/>
+    <w:rsid w:val="001E5102"/>
     <w:pPr>
       <w:keepNext/>
       <w:keepLines/>
@@ -5887,7 +6052,7 @@
     <w:semiHidden/>
     <w:unhideWhenUsed/>
     <w:qFormat/>
-    <w:rsid w:val="007C1277"/>
+    <w:rsid w:val="001E5102"/>
     <w:pPr>
       <w:keepNext/>
       <w:keepLines/>
@@ -5910,7 +6075,7 @@
     <w:semiHidden/>
     <w:unhideWhenUsed/>
     <w:qFormat/>
-    <w:rsid w:val="007C1277"/>
+    <w:rsid w:val="001E5102"/>
     <w:pPr>
       <w:keepNext/>
       <w:keepLines/>
@@ -5933,7 +6098,7 @@
     <w:semiHidden/>
     <w:unhideWhenUsed/>
     <w:qFormat/>
-    <w:rsid w:val="007C1277"/>
+    <w:rsid w:val="001E5102"/>
     <w:pPr>
       <w:keepNext/>
       <w:keepLines/>
@@ -5956,7 +6121,7 @@
     <w:semiHidden/>
     <w:unhideWhenUsed/>
     <w:qFormat/>
-    <w:rsid w:val="007C1277"/>
+    <w:rsid w:val="001E5102"/>
     <w:pPr>
       <w:keepNext/>
       <w:keepLines/>
@@ -5977,7 +6142,7 @@
     <w:semiHidden/>
     <w:unhideWhenUsed/>
     <w:qFormat/>
-    <w:rsid w:val="007C1277"/>
+    <w:rsid w:val="001E5102"/>
     <w:pPr>
       <w:keepNext/>
       <w:keepLines/>
@@ -6000,7 +6165,7 @@
     <w:semiHidden/>
     <w:unhideWhenUsed/>
     <w:qFormat/>
-    <w:rsid w:val="007C1277"/>
+    <w:rsid w:val="001E5102"/>
     <w:pPr>
       <w:keepNext/>
       <w:keepLines/>
@@ -6021,7 +6186,7 @@
     <w:semiHidden/>
     <w:unhideWhenUsed/>
     <w:qFormat/>
-    <w:rsid w:val="007C1277"/>
+    <w:rsid w:val="001E5102"/>
     <w:pPr>
       <w:keepNext/>
       <w:keepLines/>
@@ -6044,7 +6209,7 @@
     <w:semiHidden/>
     <w:unhideWhenUsed/>
     <w:qFormat/>
-    <w:rsid w:val="007C1277"/>
+    <w:rsid w:val="001E5102"/>
     <w:pPr>
       <w:keepNext/>
       <w:keepLines/>
@@ -6088,7 +6253,7 @@
     <w:basedOn w:val="Fontepargpadro"/>
     <w:link w:val="Ttulo1"/>
     <w:uiPriority w:val="9"/>
-    <w:rsid w:val="007C1277"/>
+    <w:rsid w:val="001E5102"/>
     <w:rPr>
       <w:rFonts w:asciiTheme="majorHAnsi" w:eastAsiaTheme="majorEastAsia" w:hAnsiTheme="majorHAnsi" w:cstheme="majorBidi"/>
       <w:color w:val="0F4761" w:themeColor="accent1" w:themeShade="BF"/>
@@ -6102,7 +6267,7 @@
     <w:link w:val="Ttulo2"/>
     <w:uiPriority w:val="9"/>
     <w:semiHidden/>
-    <w:rsid w:val="007C1277"/>
+    <w:rsid w:val="001E5102"/>
     <w:rPr>
       <w:rFonts w:asciiTheme="majorHAnsi" w:eastAsiaTheme="majorEastAsia" w:hAnsiTheme="majorHAnsi" w:cstheme="majorBidi"/>
       <w:color w:val="0F4761" w:themeColor="accent1" w:themeShade="BF"/>
@@ -6116,7 +6281,7 @@
     <w:link w:val="Ttulo3"/>
     <w:uiPriority w:val="9"/>
     <w:semiHidden/>
-    <w:rsid w:val="007C1277"/>
+    <w:rsid w:val="001E5102"/>
     <w:rPr>
       <w:rFonts w:eastAsiaTheme="majorEastAsia" w:cstheme="majorBidi"/>
       <w:color w:val="0F4761" w:themeColor="accent1" w:themeShade="BF"/>
@@ -6130,7 +6295,7 @@
     <w:link w:val="Ttulo4"/>
     <w:uiPriority w:val="9"/>
     <w:semiHidden/>
-    <w:rsid w:val="007C1277"/>
+    <w:rsid w:val="001E5102"/>
     <w:rPr>
       <w:rFonts w:eastAsiaTheme="majorEastAsia" w:cstheme="majorBidi"/>
       <w:i/>
@@ -6144,7 +6309,7 @@
     <w:link w:val="Ttulo5"/>
     <w:uiPriority w:val="9"/>
     <w:semiHidden/>
-    <w:rsid w:val="007C1277"/>
+    <w:rsid w:val="001E5102"/>
     <w:rPr>
       <w:rFonts w:eastAsiaTheme="majorEastAsia" w:cstheme="majorBidi"/>
       <w:color w:val="0F4761" w:themeColor="accent1" w:themeShade="BF"/>
@@ -6156,7 +6321,7 @@
     <w:link w:val="Ttulo6"/>
     <w:uiPriority w:val="9"/>
     <w:semiHidden/>
-    <w:rsid w:val="007C1277"/>
+    <w:rsid w:val="001E5102"/>
     <w:rPr>
       <w:rFonts w:eastAsiaTheme="majorEastAsia" w:cstheme="majorBidi"/>
       <w:i/>
@@ -6170,7 +6335,7 @@
     <w:link w:val="Ttulo7"/>
     <w:uiPriority w:val="9"/>
     <w:semiHidden/>
-    <w:rsid w:val="007C1277"/>
+    <w:rsid w:val="001E5102"/>
     <w:rPr>
       <w:rFonts w:eastAsiaTheme="majorEastAsia" w:cstheme="majorBidi"/>
       <w:color w:val="595959" w:themeColor="text1" w:themeTint="A6"/>
@@ -6182,7 +6347,7 @@
     <w:link w:val="Ttulo8"/>
     <w:uiPriority w:val="9"/>
     <w:semiHidden/>
-    <w:rsid w:val="007C1277"/>
+    <w:rsid w:val="001E5102"/>
     <w:rPr>
       <w:rFonts w:eastAsiaTheme="majorEastAsia" w:cstheme="majorBidi"/>
       <w:i/>
@@ -6196,7 +6361,7 @@
     <w:link w:val="Ttulo9"/>
     <w:uiPriority w:val="9"/>
     <w:semiHidden/>
-    <w:rsid w:val="007C1277"/>
+    <w:rsid w:val="001E5102"/>
     <w:rPr>
       <w:rFonts w:eastAsiaTheme="majorEastAsia" w:cstheme="majorBidi"/>
       <w:color w:val="272727" w:themeColor="text1" w:themeTint="D8"/>
@@ -6209,7 +6374,7 @@
     <w:link w:val="TtuloChar"/>
     <w:uiPriority w:val="10"/>
     <w:qFormat/>
-    <w:rsid w:val="007C1277"/>
+    <w:rsid w:val="001E5102"/>
     <w:pPr>
       <w:spacing w:after="80" w:line="240" w:lineRule="auto"/>
       <w:contextualSpacing/>
@@ -6227,7 +6392,7 @@
     <w:basedOn w:val="Fontepargpadro"/>
     <w:link w:val="Ttulo"/>
     <w:uiPriority w:val="10"/>
-    <w:rsid w:val="007C1277"/>
+    <w:rsid w:val="001E5102"/>
     <w:rPr>
       <w:rFonts w:asciiTheme="majorHAnsi" w:eastAsiaTheme="majorEastAsia" w:hAnsiTheme="majorHAnsi" w:cstheme="majorBidi"/>
       <w:spacing w:val="-10"/>
@@ -6243,7 +6408,7 @@
     <w:link w:val="SubttuloChar"/>
     <w:uiPriority w:val="11"/>
     <w:qFormat/>
-    <w:rsid w:val="007C1277"/>
+    <w:rsid w:val="001E5102"/>
     <w:pPr>
       <w:numPr>
         <w:ilvl w:val="1"/>
@@ -6262,7 +6427,7 @@
     <w:basedOn w:val="Fontepargpadro"/>
     <w:link w:val="Subttulo"/>
     <w:uiPriority w:val="11"/>
-    <w:rsid w:val="007C1277"/>
+    <w:rsid w:val="001E5102"/>
     <w:rPr>
       <w:rFonts w:eastAsiaTheme="majorEastAsia" w:cstheme="majorBidi"/>
       <w:color w:val="595959" w:themeColor="text1" w:themeTint="A6"/>
@@ -6278,7 +6443,7 @@
     <w:link w:val="CitaoChar"/>
     <w:uiPriority w:val="29"/>
     <w:qFormat/>
-    <w:rsid w:val="007C1277"/>
+    <w:rsid w:val="001E5102"/>
     <w:pPr>
       <w:spacing w:before="160"/>
       <w:jc w:val="center"/>
@@ -6294,7 +6459,7 @@
     <w:basedOn w:val="Fontepargpadro"/>
     <w:link w:val="Citao"/>
     <w:uiPriority w:val="29"/>
-    <w:rsid w:val="007C1277"/>
+    <w:rsid w:val="001E5102"/>
     <w:rPr>
       <w:i/>
       <w:iCs/>
@@ -6306,7 +6471,7 @@
     <w:basedOn w:val="Normal"/>
     <w:uiPriority w:val="34"/>
     <w:qFormat/>
-    <w:rsid w:val="007C1277"/>
+    <w:rsid w:val="001E5102"/>
     <w:pPr>
       <w:ind w:left="720"/>
       <w:contextualSpacing/>
@@ -6317,7 +6482,7 @@
     <w:basedOn w:val="Fontepargpadro"/>
     <w:uiPriority w:val="21"/>
     <w:qFormat/>
-    <w:rsid w:val="007C1277"/>
+    <w:rsid w:val="001E5102"/>
     <w:rPr>
       <w:i/>
       <w:iCs/>
@@ -6331,7 +6496,7 @@
     <w:link w:val="CitaoIntensaChar"/>
     <w:uiPriority w:val="30"/>
     <w:qFormat/>
-    <w:rsid w:val="007C1277"/>
+    <w:rsid w:val="001E5102"/>
     <w:pPr>
       <w:pBdr>
         <w:top w:val="single" w:sz="4" w:space="10" w:color="0F4761" w:themeColor="accent1" w:themeShade="BF"/>
@@ -6352,7 +6517,7 @@
     <w:basedOn w:val="Fontepargpadro"/>
     <w:link w:val="CitaoIntensa"/>
     <w:uiPriority w:val="30"/>
-    <w:rsid w:val="007C1277"/>
+    <w:rsid w:val="001E5102"/>
     <w:rPr>
       <w:i/>
       <w:iCs/>
@@ -6364,7 +6529,7 @@
     <w:basedOn w:val="Fontepargpadro"/>
     <w:uiPriority w:val="32"/>
     <w:qFormat/>
-    <w:rsid w:val="007C1277"/>
+    <w:rsid w:val="001E5102"/>
     <w:rPr>
       <w:b/>
       <w:bCs/>

</xml_diff>